<commit_message>
docs: add eBox PPT assets and download quick-start note, update manual
</commit_message>
<xml_diff>
--- a/docs/eBox 使用手册.docx
+++ b/docs/eBox 使用手册.docx
@@ -12,12 +12,7 @@
         <w:jc w:val="left"/>
       </w:pPr>
       <w:r>
-        <w:t>eBox 使用手册（Q</w:t>
-      </w:r>
-      <w:bookmarkStart w:id="0" w:name="_GoBack"/>
-      <w:bookmarkEnd w:id="0"/>
-      <w:r>
-        <w:t>YWX多开版）</w:t>
+        <w:t>eBox 使用手册（QYWX多开版）</w:t>
       </w:r>
     </w:p>
     <w:p>
@@ -576,36 +571,42 @@
         <w:jc w:val="left"/>
       </w:pPr>
       <w:r>
-        <w:t>购买地址：</w:t>
-      </w:r>
-      <w:r>
-        <w:rPr>
-          <w:rFonts w:ascii="PingFang SC" w:hAnsi="PingFang SC" w:eastAsia="PingFang SC" w:cs="PingFang SC"/>
+        <w:t>购买地址</w:t>
+      </w:r>
+      <w:r>
+        <w:rPr>
+          <w:rFonts w:hint="default" w:asciiTheme="minorAscii" w:hAnsiTheme="minorAscii"/>
+        </w:rPr>
+        <w:t>：</w:t>
+      </w:r>
+      <w:r>
+        <w:rPr>
+          <w:rFonts w:hint="default" w:eastAsia="PingFang SC" w:cs="PingFang SC" w:asciiTheme="minorAscii" w:hAnsiTheme="minorAscii"/>
         </w:rPr>
         <w:fldChar w:fldCharType="begin"/>
       </w:r>
       <w:r>
         <w:rPr>
-          <w:rFonts w:ascii="PingFang SC" w:hAnsi="PingFang SC" w:eastAsia="PingFang SC" w:cs="PingFang SC"/>
+          <w:rFonts w:hint="default" w:eastAsia="PingFang SC" w:cs="PingFang SC" w:asciiTheme="minorAscii" w:hAnsiTheme="minorAscii"/>
         </w:rPr>
         <w:instrText xml:space="preserve"> HYPERLINK "https://noepay.cn/" \t "_blank" </w:instrText>
       </w:r>
       <w:r>
         <w:rPr>
-          <w:rFonts w:ascii="PingFang SC" w:hAnsi="PingFang SC" w:eastAsia="PingFang SC" w:cs="PingFang SC"/>
+          <w:rFonts w:hint="default" w:eastAsia="PingFang SC" w:cs="PingFang SC" w:asciiTheme="minorAscii" w:hAnsiTheme="minorAscii"/>
         </w:rPr>
         <w:fldChar w:fldCharType="separate"/>
       </w:r>
       <w:r>
         <w:rPr>
           <w:rStyle w:val="8"/>
-          <w:rFonts w:hint="default" w:ascii="PingFang SC" w:hAnsi="PingFang SC" w:eastAsia="PingFang SC" w:cs="PingFang SC"/>
+          <w:rFonts w:hint="default" w:eastAsia="PingFang SC" w:cs="PingFang SC" w:asciiTheme="minorAscii" w:hAnsiTheme="minorAscii"/>
         </w:rPr>
         <w:t>https://noepay.cn</w:t>
       </w:r>
       <w:r>
         <w:rPr>
-          <w:rFonts w:hint="default" w:ascii="PingFang SC" w:hAnsi="PingFang SC" w:eastAsia="PingFang SC" w:cs="PingFang SC"/>
+          <w:rFonts w:hint="default" w:eastAsia="PingFang SC" w:cs="PingFang SC" w:asciiTheme="minorAscii" w:hAnsiTheme="minorAscii"/>
         </w:rPr>
         <w:fldChar w:fldCharType="end"/>
       </w:r>
@@ -622,9 +623,12 @@
       <w:r>
         <w:t>2.2 激活码说明</w:t>
       </w:r>
+      <w:bookmarkStart w:id="0" w:name="_GoBack"/>
+      <w:bookmarkEnd w:id="0"/>
     </w:p>
     <w:tbl>
       <w:tblPr>
+        <w:tblStyle w:val="6"/>
         <w:tblW w:w="0" w:type="auto"/>
         <w:tblCellSpacing w:w="15" w:type="dxa"/>
         <w:tblInd w:w="0" w:type="dxa"/>
@@ -636,7 +640,7 @@
           <w:insideH w:val="none" w:color="auto" w:sz="0" w:space="0"/>
           <w:insideV w:val="none" w:color="auto" w:sz="0" w:space="0"/>
         </w:tblBorders>
-        <w:shd w:val="clear"/>
+        <w:shd w:val="clear" w:color="auto" w:fill="auto"/>
         <w:tblLayout w:type="autofit"/>
         <w:tblCellMar>
           <w:top w:w="15" w:type="dxa"/>
@@ -658,6 +662,7 @@
             <w:insideH w:val="none" w:color="auto" w:sz="0" w:space="0"/>
             <w:insideV w:val="none" w:color="auto" w:sz="0" w:space="0"/>
           </w:tblBorders>
+          <w:shd w:val="clear" w:color="auto" w:fill="auto"/>
           <w:tblCellMar>
             <w:top w:w="15" w:type="dxa"/>
             <w:left w:w="15" w:type="dxa"/>
@@ -671,7 +676,7 @@
         <w:tc>
           <w:tcPr>
             <w:tcW w:w="0" w:type="auto"/>
-            <w:shd w:val="clear"/>
+            <w:shd w:val="clear" w:color="auto" w:fill="auto"/>
             <w:vAlign w:val="center"/>
           </w:tcPr>
           <w:p>
@@ -728,6 +733,7 @@
     </w:p>
     <w:tbl>
       <w:tblPr>
+        <w:tblStyle w:val="6"/>
         <w:tblW w:w="0" w:type="auto"/>
         <w:tblCellSpacing w:w="15" w:type="dxa"/>
         <w:tblInd w:w="0" w:type="dxa"/>
@@ -739,7 +745,7 @@
           <w:insideH w:val="none" w:color="auto" w:sz="0" w:space="0"/>
           <w:insideV w:val="none" w:color="auto" w:sz="0" w:space="0"/>
         </w:tblBorders>
-        <w:shd w:val="clear"/>
+        <w:shd w:val="clear" w:color="auto" w:fill="auto"/>
         <w:tblLayout w:type="autofit"/>
         <w:tblCellMar>
           <w:top w:w="15" w:type="dxa"/>
@@ -761,13 +767,7 @@
             <w:insideH w:val="none" w:color="auto" w:sz="0" w:space="0"/>
             <w:insideV w:val="none" w:color="auto" w:sz="0" w:space="0"/>
           </w:tblBorders>
-          <w:shd w:val="clear"/>
-          <w:tblCellMar>
-            <w:top w:w="15" w:type="dxa"/>
-            <w:left w:w="15" w:type="dxa"/>
-            <w:bottom w:w="15" w:type="dxa"/>
-            <w:right w:w="15" w:type="dxa"/>
-          </w:tblCellMar>
+          <w:shd w:val="clear" w:color="auto" w:fill="auto"/>
         </w:tblPrEx>
         <w:trPr>
           <w:tblCellSpacing w:w="15" w:type="dxa"/>
@@ -775,7 +775,7 @@
         <w:tc>
           <w:tcPr>
             <w:tcW w:w="0" w:type="auto"/>
-            <w:shd w:val="clear"/>
+            <w:shd w:val="clear" w:color="auto" w:fill="auto"/>
             <w:vAlign w:val="center"/>
           </w:tcPr>
           <w:p>
@@ -1027,6 +1027,7 @@
     </w:p>
     <w:tbl>
       <w:tblPr>
+        <w:tblStyle w:val="6"/>
         <w:tblW w:w="0" w:type="auto"/>
         <w:tblCellSpacing w:w="15" w:type="dxa"/>
         <w:tblInd w:w="0" w:type="dxa"/>
@@ -1038,7 +1039,7 @@
           <w:insideH w:val="none" w:color="auto" w:sz="0" w:space="0"/>
           <w:insideV w:val="none" w:color="auto" w:sz="0" w:space="0"/>
         </w:tblBorders>
-        <w:shd w:val="clear"/>
+        <w:shd w:val="clear" w:color="auto" w:fill="auto"/>
         <w:tblLayout w:type="autofit"/>
         <w:tblCellMar>
           <w:top w:w="15" w:type="dxa"/>
@@ -1060,7 +1061,7 @@
             <w:insideH w:val="none" w:color="auto" w:sz="0" w:space="0"/>
             <w:insideV w:val="none" w:color="auto" w:sz="0" w:space="0"/>
           </w:tblBorders>
-          <w:shd w:val="clear"/>
+          <w:shd w:val="clear" w:color="auto" w:fill="auto"/>
           <w:tblCellMar>
             <w:top w:w="15" w:type="dxa"/>
             <w:left w:w="15" w:type="dxa"/>
@@ -1074,7 +1075,7 @@
         <w:tc>
           <w:tcPr>
             <w:tcW w:w="0" w:type="auto"/>
-            <w:shd w:val="clear"/>
+            <w:shd w:val="clear" w:color="auto" w:fill="auto"/>
             <w:vAlign w:val="center"/>
           </w:tcPr>
           <w:p>
@@ -1378,6 +1379,7 @@
     </w:p>
     <w:tbl>
       <w:tblPr>
+        <w:tblStyle w:val="6"/>
         <w:tblW w:w="0" w:type="auto"/>
         <w:tblCellSpacing w:w="15" w:type="dxa"/>
         <w:tblInd w:w="0" w:type="dxa"/>
@@ -1389,7 +1391,7 @@
           <w:insideH w:val="none" w:color="auto" w:sz="0" w:space="0"/>
           <w:insideV w:val="none" w:color="auto" w:sz="0" w:space="0"/>
         </w:tblBorders>
-        <w:shd w:val="clear"/>
+        <w:shd w:val="clear" w:color="auto" w:fill="auto"/>
         <w:tblLayout w:type="autofit"/>
         <w:tblCellMar>
           <w:top w:w="15" w:type="dxa"/>
@@ -1411,7 +1413,7 @@
             <w:insideH w:val="none" w:color="auto" w:sz="0" w:space="0"/>
             <w:insideV w:val="none" w:color="auto" w:sz="0" w:space="0"/>
           </w:tblBorders>
-          <w:shd w:val="clear"/>
+          <w:shd w:val="clear" w:color="auto" w:fill="auto"/>
           <w:tblCellMar>
             <w:top w:w="15" w:type="dxa"/>
             <w:left w:w="15" w:type="dxa"/>
@@ -1425,7 +1427,7 @@
         <w:tc>
           <w:tcPr>
             <w:tcW w:w="0" w:type="auto"/>
-            <w:shd w:val="clear"/>
+            <w:shd w:val="clear" w:color="auto" w:fill="auto"/>
             <w:vAlign w:val="center"/>
           </w:tcPr>
           <w:p>
@@ -2184,6 +2186,7 @@
     </w:p>
     <w:tbl>
       <w:tblPr>
+        <w:tblStyle w:val="6"/>
         <w:tblW w:w="0" w:type="auto"/>
         <w:tblCellSpacing w:w="15" w:type="dxa"/>
         <w:tblInd w:w="0" w:type="dxa"/>
@@ -2195,7 +2198,7 @@
           <w:insideH w:val="none" w:color="auto" w:sz="0" w:space="0"/>
           <w:insideV w:val="none" w:color="auto" w:sz="0" w:space="0"/>
         </w:tblBorders>
-        <w:shd w:val="clear"/>
+        <w:shd w:val="clear" w:color="auto" w:fill="auto"/>
         <w:tblLayout w:type="autofit"/>
         <w:tblCellMar>
           <w:top w:w="15" w:type="dxa"/>
@@ -2217,7 +2220,7 @@
             <w:insideH w:val="none" w:color="auto" w:sz="0" w:space="0"/>
             <w:insideV w:val="none" w:color="auto" w:sz="0" w:space="0"/>
           </w:tblBorders>
-          <w:shd w:val="clear"/>
+          <w:shd w:val="clear" w:color="auto" w:fill="auto"/>
           <w:tblCellMar>
             <w:top w:w="15" w:type="dxa"/>
             <w:left w:w="15" w:type="dxa"/>
@@ -2231,7 +2234,7 @@
         <w:tc>
           <w:tcPr>
             <w:tcW w:w="0" w:type="auto"/>
-            <w:shd w:val="clear"/>
+            <w:shd w:val="clear" w:color="auto" w:fill="auto"/>
             <w:vAlign w:val="center"/>
           </w:tcPr>
           <w:p>
@@ -2385,38 +2388,41 @@
         <w:widowControl/>
         <w:suppressLineNumbers w:val="0"/>
         <w:jc w:val="left"/>
+        <w:rPr>
+          <w:rFonts w:hint="default" w:asciiTheme="minorAscii" w:hAnsiTheme="minorAscii"/>
+        </w:rPr>
       </w:pPr>
       <w:r>
         <w:t>微信客服：</w:t>
       </w:r>
       <w:r>
         <w:rPr>
-          <w:rFonts w:hint="default" w:ascii="PingFang SC" w:hAnsi="PingFang SC" w:eastAsia="PingFang SC" w:cs="PingFang SC"/>
+          <w:rFonts w:hint="default" w:eastAsia="PingFang SC" w:cs="PingFang SC" w:asciiTheme="minorAscii" w:hAnsiTheme="minorAscii"/>
         </w:rPr>
         <w:fldChar w:fldCharType="begin"/>
       </w:r>
       <w:r>
         <w:rPr>
-          <w:rFonts w:hint="default" w:ascii="PingFang SC" w:hAnsi="PingFang SC" w:eastAsia="PingFang SC" w:cs="PingFang SC"/>
+          <w:rFonts w:hint="default" w:eastAsia="PingFang SC" w:cs="PingFang SC" w:asciiTheme="minorAscii" w:hAnsiTheme="minorAscii"/>
         </w:rPr>
         <w:instrText xml:space="preserve"> HYPERLINK "https://xn--:https-9k7kk86e//work.weixin.qq.com/kfid/kfce45838d309351f53" \t "_blank" </w:instrText>
       </w:r>
       <w:r>
         <w:rPr>
-          <w:rFonts w:hint="default" w:ascii="PingFang SC" w:hAnsi="PingFang SC" w:eastAsia="PingFang SC" w:cs="PingFang SC"/>
+          <w:rFonts w:hint="default" w:eastAsia="PingFang SC" w:cs="PingFang SC" w:asciiTheme="minorAscii" w:hAnsiTheme="minorAscii"/>
         </w:rPr>
         <w:fldChar w:fldCharType="separate"/>
       </w:r>
       <w:r>
         <w:rPr>
           <w:rStyle w:val="8"/>
-          <w:rFonts w:hint="default" w:ascii="PingFang SC" w:hAnsi="PingFang SC" w:eastAsia="PingFang SC" w:cs="PingFang SC"/>
+          <w:rFonts w:hint="default" w:eastAsia="PingFang SC" w:cs="PingFang SC" w:asciiTheme="minorAscii" w:hAnsiTheme="minorAscii"/>
         </w:rPr>
         <w:t>https://work.weixin.qq.com/kfid/kfce45838d309351f53</w:t>
       </w:r>
       <w:r>
         <w:rPr>
-          <w:rFonts w:hint="default" w:ascii="PingFang SC" w:hAnsi="PingFang SC" w:eastAsia="PingFang SC" w:cs="PingFang SC"/>
+          <w:rFonts w:hint="default" w:eastAsia="PingFang SC" w:cs="PingFang SC" w:asciiTheme="minorAscii" w:hAnsiTheme="minorAscii"/>
         </w:rPr>
         <w:fldChar w:fldCharType="end"/>
       </w:r>
@@ -2535,6 +2541,9 @@
         <w:widowControl/>
         <w:suppressLineNumbers w:val="0"/>
         <w:jc w:val="left"/>
+        <w:rPr>
+          <w:rFonts w:hint="default" w:eastAsia="PingFang SC" w:cs="PingFang SC" w:asciiTheme="minorAscii" w:hAnsiTheme="minorAscii"/>
+        </w:rPr>
       </w:pPr>
       <w:r>
         <w:rPr>
@@ -2548,32 +2557,32 @@
       </w:r>
       <w:r>
         <w:rPr>
-          <w:rFonts w:hint="default" w:ascii="PingFang SC" w:hAnsi="PingFang SC" w:eastAsia="PingFang SC" w:cs="PingFang SC"/>
+          <w:rFonts w:hint="default" w:eastAsia="PingFang SC" w:cs="PingFang SC" w:asciiTheme="minorAscii" w:hAnsiTheme="minorAscii"/>
         </w:rPr>
         <w:fldChar w:fldCharType="begin"/>
       </w:r>
       <w:r>
         <w:rPr>
-          <w:rFonts w:hint="default" w:ascii="PingFang SC" w:hAnsi="PingFang SC" w:eastAsia="PingFang SC" w:cs="PingFang SC"/>
-        </w:rPr>
-        <w:instrText xml:space="preserve"> HYPERLINK "https://wwbvf.lanzouu.com/iStSl41h5i9a" \t "_blank" </w:instrText>
-      </w:r>
-      <w:r>
-        <w:rPr>
-          <w:rFonts w:hint="default" w:ascii="PingFang SC" w:hAnsi="PingFang SC" w:eastAsia="PingFang SC" w:cs="PingFang SC"/>
+          <w:rFonts w:hint="default" w:eastAsia="PingFang SC" w:cs="PingFang SC" w:asciiTheme="minorAscii" w:hAnsiTheme="minorAscii"/>
+        </w:rPr>
+        <w:instrText xml:space="preserve"> HYPERLINK "https://wwbvf.lanzouu.com/b00tcpfz0d" </w:instrText>
+      </w:r>
+      <w:r>
+        <w:rPr>
+          <w:rFonts w:hint="default" w:eastAsia="PingFang SC" w:cs="PingFang SC" w:asciiTheme="minorAscii" w:hAnsiTheme="minorAscii"/>
         </w:rPr>
         <w:fldChar w:fldCharType="separate"/>
       </w:r>
       <w:r>
         <w:rPr>
           <w:rStyle w:val="8"/>
-          <w:rFonts w:hint="default" w:ascii="PingFang SC" w:hAnsi="PingFang SC" w:eastAsia="PingFang SC" w:cs="PingFang SC"/>
-        </w:rPr>
-        <w:t>https://wwbvf.lanzouu.com/iStSl41h5i9a</w:t>
-      </w:r>
-      <w:r>
-        <w:rPr>
-          <w:rFonts w:hint="default" w:ascii="PingFang SC" w:hAnsi="PingFang SC" w:eastAsia="PingFang SC" w:cs="PingFang SC"/>
+          <w:rFonts w:hint="default" w:eastAsia="PingFang SC" w:cs="PingFang SC" w:asciiTheme="minorAscii" w:hAnsiTheme="minorAscii"/>
+        </w:rPr>
+        <w:t>https://wwbvf.lanzouu.com/b00tcpfz0d</w:t>
+      </w:r>
+      <w:r>
+        <w:rPr>
+          <w:rFonts w:hint="default" w:eastAsia="PingFang SC" w:cs="PingFang SC" w:asciiTheme="minorAscii" w:hAnsiTheme="minorAscii"/>
         </w:rPr>
         <w:fldChar w:fldCharType="end"/>
       </w:r>
@@ -2586,18 +2595,24 @@
         <w:widowControl/>
         <w:suppressLineNumbers w:val="0"/>
         <w:jc w:val="left"/>
-      </w:pPr>
-      <w:r>
-        <w:t>密码:h07b</w:t>
-      </w:r>
-    </w:p>
-    <w:p>
-      <w:pPr>
-        <w:keepNext w:val="0"/>
-        <w:keepLines w:val="0"/>
-        <w:widowControl/>
-        <w:suppressLineNumbers w:val="0"/>
-        <w:ind w:left="720" w:right="720"/>
+        <w:rPr>
+          <w:rFonts w:hint="default" w:eastAsia="PingFang SC" w:cs="PingFang SC" w:asciiTheme="minorAscii" w:hAnsiTheme="minorAscii"/>
+        </w:rPr>
+      </w:pPr>
+      <w:r>
+        <w:rPr>
+          <w:rFonts w:hint="default" w:eastAsia="PingFang SC" w:cs="PingFang SC" w:asciiTheme="minorAscii" w:hAnsiTheme="minorAscii"/>
+        </w:rPr>
+        <w:t>密码:96m1</w:t>
+      </w:r>
+    </w:p>
+    <w:p>
+      <w:pPr>
+        <w:keepNext w:val="0"/>
+        <w:keepLines w:val="0"/>
+        <w:widowControl/>
+        <w:suppressLineNumbers w:val="0"/>
+        <w:ind w:right="720"/>
         <w:jc w:val="left"/>
         <w:rPr>
           <w:rFonts w:hint="eastAsia" w:ascii="宋体" w:hAnsi="宋体" w:eastAsia="宋体" w:cs="宋体"/>
@@ -2735,7 +2750,7 @@
     <w:lsdException w:unhideWhenUsed="0" w:uiPriority="0" w:semiHidden="0" w:name="Document Map"/>
     <w:lsdException w:unhideWhenUsed="0" w:uiPriority="0" w:semiHidden="0" w:name="Plain Text"/>
     <w:lsdException w:unhideWhenUsed="0" w:uiPriority="0" w:semiHidden="0" w:name="E-mail Signature"/>
-    <w:lsdException w:unhideWhenUsed="0" w:uiPriority="0" w:semiHidden="0" w:name="Normal (Web)"/>
+    <w:lsdException w:qFormat="1" w:unhideWhenUsed="0" w:uiPriority="0" w:semiHidden="0" w:name="Normal (Web)"/>
     <w:lsdException w:unhideWhenUsed="0" w:uiPriority="0" w:semiHidden="0" w:name="HTML Acronym"/>
     <w:lsdException w:unhideWhenUsed="0" w:uiPriority="0" w:semiHidden="0" w:name="HTML Address"/>
     <w:lsdException w:unhideWhenUsed="0" w:uiPriority="0" w:semiHidden="0" w:name="HTML Cite"/>
@@ -2993,6 +3008,7 @@
   <w:style w:type="paragraph" w:styleId="5">
     <w:name w:val="Normal (Web)"/>
     <w:basedOn w:val="1"/>
+    <w:qFormat/>
     <w:uiPriority w:val="0"/>
     <w:pPr>
       <w:spacing w:before="0" w:beforeAutospacing="1" w:after="0" w:afterAutospacing="1"/>

</xml_diff>